<commit_message>
SOP-R02-01 v1.2: apply maker-checker wording and record sheet corrections
</commit_message>
<xml_diff>
--- a/docs/procedures/SOP-R02-01_R02_Renewal_Overdue_Procedure_v1.2.docx
+++ b/docs/procedures/SOP-R02-01_R02_Renewal_Overdue_Procedure_v1.2.docx
@@ -236,7 +236,7 @@
                 <w:sz w:val="18"/>
                 <w:szCs w:val="18"/>
               </w:rPr>
-              <w:t xml:space="preserve">1.1</w:t>
+              <w:t>1.2</w:t>
             </w:r>
           </w:p>
         </w:tc>
@@ -492,7 +492,7 @@
                 <w:sz w:val="18"/>
                 <w:szCs w:val="18"/>
               </w:rPr>
-              <w:t xml:space="preserve">Current (supersedes v1.0)</w:t>
+              <w:t>Current (supersedes v1.1)</w:t>
             </w:r>
           </w:p>
         </w:tc>
@@ -1771,7 +1771,7 @@
                 <w:sz w:val="17"/>
                 <w:szCs w:val="17"/>
               </w:rPr>
-              <w:t xml:space="preserve">Query reply log</w:t>
+              <w:t>Lodgment_Log</w:t>
             </w:r>
           </w:p>
         </w:tc>
@@ -2380,7 +2380,7 @@
           <w:sz w:val="20"/>
           <w:szCs w:val="20"/>
         </w:rPr>
-        <w:t xml:space="preserve">Maker-checker: the checker is never the maker (enforced by data validation in the Checker_Log sheet).</w:t>
+        <w:t>Maker-checker: the checker must not be the maker. The Checker_Log flags a match ("CHECK: maker equals checker") but does not block it, so the checker reviews the flag column daily.</w:t>
       </w:r>
     </w:p>
     <w:p>
@@ -2858,6 +2858,48 @@
                 <w:szCs w:val="17"/>
               </w:rPr>
               <w:t xml:space="preserve">R02 SLA reduced from 48 hours to 24 hours (change request CR-001, simulated). Sections 2, 5 and 6 updated.</w:t>
+            </w:r>
+          </w:p>
+        </w:tc>
+      </w:tr>
+      <w:tr>
+        <w:tc>
+          <w:tcPr>
+            <w:tcW w:type="dxa" w:w="1300"/>
+          </w:tcPr>
+          <w:p>
+            <w:r>
+              <w:t>1.2</w:t>
+            </w:r>
+          </w:p>
+        </w:tc>
+        <w:tc>
+          <w:tcPr>
+            <w:tcW w:type="dxa" w:w="1900"/>
+          </w:tcPr>
+          <w:p>
+            <w:r>
+              <w:t>2026-10-06</w:t>
+            </w:r>
+          </w:p>
+        </w:tc>
+        <w:tc>
+          <w:tcPr>
+            <w:tcW w:type="dxa" w:w="3000"/>
+          </w:tcPr>
+          <w:p>
+            <w:r>
+              <w:t>Kanishka Singh</w:t>
+            </w:r>
+          </w:p>
+        </w:tc>
+        <w:tc>
+          <w:tcPr>
+            <w:tcW w:type="dxa" w:w="3438"/>
+          </w:tcPr>
+          <w:p>
+            <w:r>
+              <w:t>Section 7 corrected to match tested Checker_Log behaviour; step 3 record sheet corrected.</w:t>
             </w:r>
           </w:p>
         </w:tc>
@@ -3415,7 +3457,7 @@
         <w:sz w:val="16"/>
         <w:szCs w:val="16"/>
       </w:rPr>
-      <w:t xml:space="preserve">SOP-R02-01  |  R02 Renewal Overdue Procedure  |  v1.1</w:t>
+      <w:t>SOP-R02-01  |  R02 Renewal Overdue Procedure  |  v1.2</w:t>
     </w:r>
   </w:p>
 </w:hdr>

</xml_diff>